<commit_message>
updates prior to first release
updates prior to first release
</commit_message>
<xml_diff>
--- a/Manual.docx
+++ b/Manual.docx
@@ -10,7 +10,15 @@
         <w:t>Manual physiological in silico digestion model</w:t>
       </w:r>
       <w:r>
-        <w:t xml:space="preserve"> (DigSim)</w:t>
+        <w:t xml:space="preserve"> (</w:t>
+      </w:r>
+      <w:proofErr w:type="spellStart"/>
+      <w:r>
+        <w:t>DigSim</w:t>
+      </w:r>
+      <w:proofErr w:type="spellEnd"/>
+      <w:r>
+        <w:t>)</w:t>
       </w:r>
     </w:p>
     <w:p>
@@ -61,7 +69,15 @@
         <w:t xml:space="preserve">In this folder you will find a map that contains an executable of </w:t>
       </w:r>
       <w:r>
-        <w:t xml:space="preserve">the physiological in silico digestion program DigSim </w:t>
+        <w:t xml:space="preserve">the physiological in silico digestion program </w:t>
+      </w:r>
+      <w:proofErr w:type="spellStart"/>
+      <w:r>
+        <w:t>DigSim</w:t>
+      </w:r>
+      <w:proofErr w:type="spellEnd"/>
+      <w:r>
+        <w:t xml:space="preserve"> </w:t>
       </w:r>
       <w:r>
         <w:t xml:space="preserve">with two </w:t>
@@ -82,7 +98,19 @@
     <w:p/>
     <w:p>
       <w:r>
-        <w:t xml:space="preserve">If the program does not work, check the setting of your computer for its setting of a decimal </w:t>
+        <w:t xml:space="preserve">If the program does not work, check your computer for its </w:t>
+      </w:r>
+      <w:r>
+        <w:t xml:space="preserve">decimal </w:t>
+      </w:r>
+      <w:r>
+        <w:t>setting</w:t>
+      </w:r>
+      <w:r>
+        <w:t>:</w:t>
+      </w:r>
+      <w:r>
+        <w:t xml:space="preserve"> </w:t>
       </w:r>
       <w:r>
         <w:t>“</w:t>
@@ -197,7 +225,48 @@
         <w:t xml:space="preserve">to a directory on your computer. </w:t>
       </w:r>
       <w:r>
-        <w:t>For this you use the “clone repository” option: clone the repository Georgevanaken/DigSim into a map on your computer.</w:t>
+        <w:t xml:space="preserve">For this you use the “clone repository” option: clone the repository </w:t>
+      </w:r>
+      <w:proofErr w:type="spellStart"/>
+      <w:r>
+        <w:t>Georgevanaken</w:t>
+      </w:r>
+      <w:proofErr w:type="spellEnd"/>
+      <w:r>
+        <w:t>/</w:t>
+      </w:r>
+      <w:proofErr w:type="spellStart"/>
+      <w:r>
+        <w:t>DigSim</w:t>
+      </w:r>
+      <w:proofErr w:type="spellEnd"/>
+      <w:r>
+        <w:t xml:space="preserve"> into a map on your computer.</w:t>
+      </w:r>
+      <w:r>
+        <w:t xml:space="preserve"> From this map on your computer you can run the program and its helper excel files and suggest changes </w:t>
+      </w:r>
+      <w:r>
+        <w:t xml:space="preserve">by pushing new version onto the </w:t>
+      </w:r>
+      <w:proofErr w:type="spellStart"/>
+      <w:r>
+        <w:t>DigSim</w:t>
+      </w:r>
+      <w:proofErr w:type="spellEnd"/>
+      <w:r>
+        <w:t xml:space="preserve"> repository </w:t>
+      </w:r>
+      <w:r>
+        <w:t xml:space="preserve">into a different branch of the </w:t>
+      </w:r>
+      <w:proofErr w:type="spellStart"/>
+      <w:r>
+        <w:t>DigSim</w:t>
+      </w:r>
+      <w:proofErr w:type="spellEnd"/>
+      <w:r>
+        <w:t xml:space="preserve"> repository. </w:t>
       </w:r>
     </w:p>
     <w:p/>
@@ -208,8 +277,13 @@
       <w:r>
         <w:t xml:space="preserve">the program </w:t>
       </w:r>
-      <w:r>
-        <w:t xml:space="preserve">DigSim </w:t>
+      <w:proofErr w:type="spellStart"/>
+      <w:r>
+        <w:t>DigSim</w:t>
+      </w:r>
+      <w:proofErr w:type="spellEnd"/>
+      <w:r>
+        <w:t xml:space="preserve"> </w:t>
       </w:r>
       <w:r>
         <w:t>in its most recent version</w:t>
@@ -220,8 +294,13 @@
       <w:r>
         <w:t xml:space="preserve"> </w:t>
       </w:r>
-      <w:r>
-        <w:t xml:space="preserve">versie </w:t>
+      <w:proofErr w:type="spellStart"/>
+      <w:r>
+        <w:t>versie</w:t>
+      </w:r>
+      <w:proofErr w:type="spellEnd"/>
+      <w:r>
+        <w:t xml:space="preserve"> </w:t>
       </w:r>
       <w:r>
         <w:t>digsim_v76_wasserstrasse_3</w:t>
@@ -245,7 +324,15 @@
         <w:t xml:space="preserve">recognizable by the </w:t>
       </w:r>
       <w:r>
-        <w:t xml:space="preserve">extension .pas and also its excutable recognizable by the </w:t>
+        <w:t xml:space="preserve">extension .pas and also its </w:t>
+      </w:r>
+      <w:proofErr w:type="spellStart"/>
+      <w:r>
+        <w:t>excutable</w:t>
+      </w:r>
+      <w:proofErr w:type="spellEnd"/>
+      <w:r>
+        <w:t xml:space="preserve"> recognizable by the </w:t>
       </w:r>
       <w:r>
         <w:t>.exe</w:t>
@@ -275,8 +362,13 @@
         <w:t xml:space="preserve">diet as a </w:t>
       </w:r>
       <w:r>
-        <w:t>timing of a sequence of various meals, in the same directory as DigSim</w:t>
-      </w:r>
+        <w:t xml:space="preserve">timing of a sequence of various meals, in the same directory as </w:t>
+      </w:r>
+      <w:proofErr w:type="spellStart"/>
+      <w:r>
+        <w:t>DigSim</w:t>
+      </w:r>
+      <w:proofErr w:type="spellEnd"/>
       <w:r>
         <w:t xml:space="preserve">, and </w:t>
       </w:r>
@@ -286,6 +378,7 @@
       <w:r>
         <w:t xml:space="preserve">output in </w:t>
       </w:r>
+      <w:proofErr w:type="spellStart"/>
       <w:r>
         <w:t>r</w:t>
       </w:r>
@@ -295,6 +388,7 @@
       <w:r>
         <w:t>xlxs</w:t>
       </w:r>
+      <w:proofErr w:type="spellEnd"/>
       <w:r>
         <w:t xml:space="preserve"> in th</w:t>
       </w:r>
@@ -362,23 +456,76 @@
         <w:t>meal.txt</w:t>
       </w:r>
       <w:r>
-        <w:t>. In my definition, a meal consists of various compounds (sugar, starch, water, protein, tracer compounds, etc</w:t>
-      </w:r>
-      <w:r>
-        <w:t>.</w:t>
-      </w:r>
-      <w:r>
-        <w:t>), has a typical particle radius, is a liquid (solid = 0) or consists of solid particles each with the same radius (“solid” in mm) and if liquid, has a viscosity (mPas)) introduced at one of each five plates a given timing.    </w:t>
+        <w:t>. In my definition, a meal consists of various comp</w:t>
+      </w:r>
+      <w:r>
+        <w:t xml:space="preserve">ounds </w:t>
+      </w:r>
+      <w:r>
+        <w:t>(</w:t>
+      </w:r>
+      <w:r>
+        <w:t xml:space="preserve">a drink, a sandwich,  vegetables, </w:t>
+      </w:r>
+      <w:r>
+        <w:t>milk chocolate</w:t>
+      </w:r>
+      <w:r>
+        <w:t xml:space="preserve">, </w:t>
+      </w:r>
+      <w:r>
+        <w:t>…)</w:t>
+      </w:r>
+      <w:r>
+        <w:t>, has a typical particle radius, is a liquid (solid = 0) or consists of solid particles each with the same radius (“solid” in mm) and if liquid, has a viscosity (</w:t>
+      </w:r>
+      <w:proofErr w:type="spellStart"/>
+      <w:r>
+        <w:t>mPas</w:t>
+      </w:r>
+      <w:proofErr w:type="spellEnd"/>
+      <w:r>
+        <w:t xml:space="preserve">)) introduced at one of each five plates a given timing. </w:t>
+      </w:r>
+      <w:r>
+        <w:t xml:space="preserve">Each compound </w:t>
+      </w:r>
+      <w:r>
+        <w:t> </w:t>
+      </w:r>
+      <w:r>
+        <w:t xml:space="preserve">consists of </w:t>
+      </w:r>
+      <w:r>
+        <w:t xml:space="preserve">a number of components </w:t>
+      </w:r>
+      <w:r>
+        <w:t>(sugar, starch, water, protein, tracer comp</w:t>
+      </w:r>
+      <w:r>
+        <w:t>onents</w:t>
+      </w:r>
+      <w:r>
+        <w:t>, etc.)</w:t>
+      </w:r>
+      <w:r>
+        <w:t>  </w:t>
       </w:r>
     </w:p>
     <w:p/>
     <w:p>
       <w:r>
-        <w:t xml:space="preserve">The meal menu starts with fields to define the menu (first sheet of the workbook, the other sheets are not really used, but can be linked to the first sheet if convenient). A menu consists of amounts (in grams) of one or more compounds (defined by compound numbers) added to one or more dishes (currently 1-5) at given times (minutes) from which the compounds are consumed at different defined rates. The purpose of the various dishes is that the compounds are not necessarily eaten together in one bite, but </w:t>
+        <w:t xml:space="preserve">The meal menu starts with fields to define the menu (first sheet of the workbook, the other sheets are not really used, but can be linked to the first sheet if convenient). A menu consists of amounts (in grams) </w:t>
       </w:r>
       <w:r>
         <w:lastRenderedPageBreak/>
-        <w:t>often in sequence and at different rates</w:t>
+        <w:t xml:space="preserve">of one or more compounds (defined by compound numbers) added to one or more dishes (currently 1-5) at given times (minutes) from which the compounds are consumed at different defined rates. The purpose of the various dishes is that the compounds are not necessarily eaten together </w:t>
+      </w:r>
+      <w:r>
+        <w:t>at once</w:t>
+      </w:r>
+      <w:r>
+        <w:t>, but often in sequence and at different rates</w:t>
       </w:r>
       <w:r>
         <w:t xml:space="preserve"> (e.g. a drink from a cup (e.g. dish 1) and a solid meal on a separate dish (e.g. dish 2))</w:t>
@@ -511,58 +658,93 @@
         <w:t>In addition to parameters such as compound pH, particle size (</w:t>
       </w:r>
       <w:r>
-        <w:t>set to 0</w:t>
+        <w:t xml:space="preserve">set to 0 </w:t>
+      </w:r>
+      <w:r>
+        <w:t>for liquid) and liquid viscosity, the fields allow to include structural and compositional disintegration of the compounds. The way I do it now for general purposes is to define an first order (exponential) decay into two other compounds, for example the decomposition time of solid 1-mm pieces of chocolate in the mouth is set to 5 second in which it melts to give molten chocolate (Chocol</w:t>
+      </w:r>
+      <w:r>
+        <w:t>a</w:t>
+      </w:r>
+      <w:r>
+        <w:t xml:space="preserve">te in stomach composition) and releases some sucrose (5% of weight). in the stomach any still remaining chocolate has similar melting time and decomposition. The molten chocolate is a high viscosity liquid, which decompose in the mouth and stomach in its components (given by compound “0”) which are fat and sugar. This approach is handy to see the effect of delayed decomposition of e.g. solids in the stomach and the half-time can be estimated from e.g. in vitro studies, but of course amore dedicated modelling of for example casein gelation and bolus erosion and the effect of pH and enzymes in this can also be included in the program itself. </w:t>
+      </w:r>
+      <w:r>
+        <w:t xml:space="preserve">The particle radius of the solid compounds are used to estimate creaming or sedimentation in the stomach by Stokes law (together with the densities and viscosity of the medium) and the retention of solid particles by the Pylorus.   </w:t>
+      </w:r>
+      <w:r>
+        <w:t> </w:t>
+      </w:r>
+    </w:p>
+    <w:p/>
+    <w:p>
+      <w:r>
+        <w:t xml:space="preserve">The last set of fields are used to define the </w:t>
+      </w:r>
+      <w:r>
+        <w:t>component</w:t>
+      </w:r>
+      <w:r>
+        <w:t xml:space="preserve"> composition (in mass %; 80 in number) of the compounds. </w:t>
+      </w:r>
+      <w:r>
+        <w:t xml:space="preserve">These </w:t>
+      </w:r>
+      <w:r>
+        <w:t>components must be d</w:t>
+      </w:r>
+      <w:r>
+        <w:t xml:space="preserve">efined within the </w:t>
+      </w:r>
+      <w:proofErr w:type="spellStart"/>
+      <w:r>
+        <w:t>DigSim</w:t>
+      </w:r>
+      <w:proofErr w:type="spellEnd"/>
+      <w:r>
+        <w:t xml:space="preserve"> program as well. </w:t>
+      </w:r>
+      <w:r>
+        <w:t xml:space="preserve">The % of each </w:t>
+      </w:r>
+      <w:r>
+        <w:t>components i</w:t>
+      </w:r>
+      <w:r>
+        <w:t>n the compounds can be altered</w:t>
+      </w:r>
+      <w:r>
+        <w:t xml:space="preserve">. </w:t>
+      </w:r>
+      <w:r>
+        <w:t>It is possible to add new c</w:t>
+      </w:r>
+      <w:r>
+        <w:t>ompounds and components</w:t>
+      </w:r>
+      <w:r>
+        <w:t>,</w:t>
       </w:r>
       <w:r>
         <w:t xml:space="preserve"> </w:t>
       </w:r>
       <w:r>
-        <w:t>for liquid) and liquid viscosity, the fields allow to include structural and compositional disintegration of the compounds. The way I do it now for general purposes is to define an first order (exponential) decay into two other compounds, for example the decomposition time of solid 1-mm pieces of chocolate in the mouth is set to 5 second in which it melts to give molten chocolate (Chocol</w:t>
-      </w:r>
-      <w:r>
-        <w:t>a</w:t>
-      </w:r>
-      <w:r>
-        <w:t xml:space="preserve">te in stomach composition) and releases some sucrose (5% of weight). in the stomach any still remaining chocolate has similar melting time and decomposition. The molten chocolate is a high viscosity liquid, which decompose in the mouth and stomach in its components (given by compound “0”) which are fat and sugar. This approach is handy to see the effect of delayed decomposition of e.g. solids in the stomach and the half-time can be estimated from e.g. in vitro studies, but of course amore dedicated modelling of for example casein gelation and bolus erosion and the effect of pH and enzymes in this can also be included in the program itself. </w:t>
-      </w:r>
-      <w:r>
-        <w:t xml:space="preserve">The particle radius of the solid compounds are used to estimate creaming or sedimentation in the stomach by Stokes law (together with the densities and viscosity of the medium) and the retention of solid particles by the Pylorus.   </w:t>
-      </w:r>
-      <w:r>
-        <w:t> </w:t>
-      </w:r>
-    </w:p>
-    <w:p/>
-    <w:p>
-      <w:r>
-        <w:t xml:space="preserve">The last set of fields are used to define the ingredient composition (in mass %; 80 in number) of the compounds. </w:t>
-      </w:r>
-      <w:r>
-        <w:t>These</w:t>
-      </w:r>
-      <w:r>
-        <w:t xml:space="preserve"> compounds and </w:t>
-      </w:r>
-      <w:r>
-        <w:t>80 ingredients are defined within the DigSim program</w:t>
-      </w:r>
-      <w:r>
-        <w:t xml:space="preserve"> as well</w:t>
-      </w:r>
-      <w:r>
-        <w:t xml:space="preserve">. </w:t>
-      </w:r>
-      <w:r>
-        <w:t xml:space="preserve">The </w:t>
-      </w:r>
-      <w:r>
-        <w:t>% of each ingredient in the compounds can be altered</w:t>
-      </w:r>
-      <w:r>
-        <w:t xml:space="preserve">. Compounds and components can also be added,  but </w:t>
-      </w:r>
-      <w:r>
-        <w:t xml:space="preserve">these changes have to be made both in this Excell input page as well as in the Pascal program itself. </w:t>
+        <w:t xml:space="preserve">compounds </w:t>
+      </w:r>
+      <w:r>
+        <w:t xml:space="preserve">should be </w:t>
+      </w:r>
+      <w:r>
+        <w:t xml:space="preserve">added to the Excel input page and </w:t>
+      </w:r>
+      <w:r>
+        <w:t xml:space="preserve">components to the Excel </w:t>
+      </w:r>
+      <w:r>
+        <w:t xml:space="preserve">input page and </w:t>
+      </w:r>
+      <w:r>
+        <w:t xml:space="preserve">in the Pascal program itself. </w:t>
       </w:r>
       <w:r>
         <w:t xml:space="preserve"> </w:t>
@@ -634,8 +816,13 @@
         <w:t xml:space="preserve"> for storage, but t</w:t>
       </w:r>
       <w:r>
-        <w:t>o make it available for the DigSim</w:t>
-      </w:r>
+        <w:t xml:space="preserve">o make it available for the </w:t>
+      </w:r>
+      <w:proofErr w:type="spellStart"/>
+      <w:r>
+        <w:t>DigSim</w:t>
+      </w:r>
+      <w:proofErr w:type="spellEnd"/>
       <w:r>
         <w:t xml:space="preserve"> program</w:t>
       </w:r>
@@ -663,20 +850,50 @@
       <w:r>
         <w:t xml:space="preserve">the </w:t>
       </w:r>
+      <w:proofErr w:type="spellStart"/>
       <w:r>
         <w:t>DigSim</w:t>
       </w:r>
-      <w:r>
-        <w:t xml:space="preserve"> Pascal program or its exe.file.</w:t>
+      <w:proofErr w:type="spellEnd"/>
+      <w:r>
+        <w:t xml:space="preserve"> Pascal program or its </w:t>
+      </w:r>
+      <w:proofErr w:type="spellStart"/>
+      <w:r>
+        <w:t>exe.file</w:t>
+      </w:r>
+      <w:proofErr w:type="spellEnd"/>
+      <w:r>
+        <w:t>.</w:t>
       </w:r>
       <w:r>
         <w:t xml:space="preserve"> </w:t>
       </w:r>
+      <w:r>
+        <w:t xml:space="preserve">This can be done through the “save as” command in </w:t>
+      </w:r>
+      <w:r>
+        <w:t>E</w:t>
+      </w:r>
+      <w:r>
+        <w:t>xcel</w:t>
+      </w:r>
+      <w:r>
+        <w:t xml:space="preserve">, which then lists a table of options. </w:t>
+      </w:r>
     </w:p>
     <w:p/>
     <w:p>
       <w:r>
-        <w:t>Next you run DigSim by simply clicking on it</w:t>
+        <w:t xml:space="preserve">Next you run </w:t>
+      </w:r>
+      <w:proofErr w:type="spellStart"/>
+      <w:r>
+        <w:t>DigSim</w:t>
+      </w:r>
+      <w:proofErr w:type="spellEnd"/>
+      <w:r>
+        <w:t xml:space="preserve"> by simply clicking on it</w:t>
       </w:r>
       <w:r>
         <w:t>, which in case of clicking on the file with exe extension stats the executable of the program, or in case of clic</w:t>
@@ -745,10 +962,32 @@
         <w:t>s</w:t>
       </w:r>
       <w:r>
-        <w:t xml:space="preserve"> if the chosen step size is a multitude of 3 or not (if not, you will see the variations related to the different stages in the gastric peristalsis). Digsim automatically stores the output in the same directory as </w:t>
-      </w:r>
-      <w:r>
-        <w:t xml:space="preserve">the Digsim program under </w:t>
+        <w:t xml:space="preserve"> if the chosen step size is </w:t>
+      </w:r>
+      <w:r>
+        <w:t xml:space="preserve">1 plus </w:t>
+      </w:r>
+      <w:r>
+        <w:t xml:space="preserve">a multitude of 3 or not (if not, you will see the variations related to the different stages in the gastric peristalsis). </w:t>
+      </w:r>
+      <w:proofErr w:type="spellStart"/>
+      <w:r>
+        <w:t>Digsim</w:t>
+      </w:r>
+      <w:proofErr w:type="spellEnd"/>
+      <w:r>
+        <w:t xml:space="preserve"> automatically stores the output in the same directory as </w:t>
+      </w:r>
+      <w:r>
+        <w:t xml:space="preserve">the </w:t>
+      </w:r>
+      <w:proofErr w:type="spellStart"/>
+      <w:r>
+        <w:t>Digsim</w:t>
+      </w:r>
+      <w:proofErr w:type="spellEnd"/>
+      <w:r>
+        <w:t xml:space="preserve"> program under </w:t>
       </w:r>
       <w:r>
         <w:rPr>
@@ -841,7 +1080,26 @@
         <w:t>ed/refreshed</w:t>
       </w:r>
       <w:r>
-        <w:t xml:space="preserve"> by the option in the Excel menu bar. </w:t>
+        <w:t xml:space="preserve"> by the </w:t>
+      </w:r>
+      <w:r>
+        <w:t xml:space="preserve">“Refresh” </w:t>
+      </w:r>
+      <w:r>
+        <w:t>option in the Excel menu bar</w:t>
+      </w:r>
+      <w:r>
+        <w:t xml:space="preserve">, after which you can also adjust the directory from which Excel </w:t>
+      </w:r>
+      <w:r>
+        <w:lastRenderedPageBreak/>
+        <w:t>sho</w:t>
+      </w:r>
+      <w:r>
+        <w:t>uld retrieve the results file</w:t>
+      </w:r>
+      <w:r>
+        <w:t xml:space="preserve">. </w:t>
       </w:r>
       <w:r>
         <w:t xml:space="preserve">Of course you can save </w:t>

</xml_diff>